<commit_message>
vp all labs upload
</commit_message>
<xml_diff>
--- a/aivmo/Отчет по контрольной работе.docx
+++ b/aivmo/Отчет по контрольной работе.docx
@@ -2644,11 +2644,7 @@
         </w:rPr>
       </w:pPr>
       <w:r>
-        <w:rPr>
-          <w:rFonts w:ascii="Times New Roman" w:hAnsi="Times New Roman"/>
-          <w:sz w:val="28"/>
-          <w:szCs w:val="28"/>
-        </w:rPr>
+        <w:rPr/>
       </w:r>
       <m:oMathPara xmlns:m="http://schemas.openxmlformats.org/officeDocument/2006/math">
         <m:oMathParaPr>
@@ -2927,11 +2923,7 @@
         </w:rPr>
       </w:pPr>
       <w:r>
-        <w:rPr>
-          <w:rFonts w:ascii="Times New Roman" w:hAnsi="Times New Roman"/>
-          <w:sz w:val="28"/>
-          <w:szCs w:val="28"/>
-        </w:rPr>
+        <w:rPr/>
       </w:r>
       <m:oMathPara xmlns:m="http://schemas.openxmlformats.org/officeDocument/2006/math">
         <m:oMathParaPr>
@@ -3200,11 +3192,7 @@
         </w:rPr>
       </w:pPr>
       <w:r>
-        <w:rPr>
-          <w:rFonts w:ascii="Times New Roman" w:hAnsi="Times New Roman"/>
-          <w:sz w:val="28"/>
-          <w:szCs w:val="28"/>
-        </w:rPr>
+        <w:rPr/>
       </w:r>
       <m:oMathPara xmlns:m="http://schemas.openxmlformats.org/officeDocument/2006/math">
         <m:oMathParaPr>
@@ -3468,6 +3456,140 @@
     </w:p>
     <w:p>
       <w:pPr>
+        <w:pStyle w:val="Normal"/>
+        <w:widowControl/>
+        <w:bidi w:val="0"/>
+        <w:spacing w:lineRule="auto" w:line="360" w:before="0" w:after="0"/>
+        <w:ind w:firstLine="737" w:left="0" w:right="0"/>
+        <w:jc w:val="left"/>
+        <w:rPr>
+          <w:rFonts w:ascii="Times New Roman" w:hAnsi="Times New Roman"/>
+          <w:sz w:val="28"/>
+          <w:szCs w:val="28"/>
+        </w:rPr>
+      </w:pPr>
+      <w:r>
+        <w:rPr>
+          <w:rFonts w:ascii="Times New Roman" w:hAnsi="Times New Roman"/>
+          <w:sz w:val="28"/>
+          <w:szCs w:val="28"/>
+        </w:rPr>
+        <w:drawing>
+          <wp:anchor behindDoc="0" distT="0" distB="0" distL="0" distR="0" simplePos="0" locked="0" layoutInCell="0" allowOverlap="1" relativeHeight="19">
+            <wp:simplePos x="0" y="0"/>
+            <wp:positionH relativeFrom="column">
+              <wp:align>center</wp:align>
+            </wp:positionH>
+            <wp:positionV relativeFrom="paragraph">
+              <wp:posOffset>635</wp:posOffset>
+            </wp:positionV>
+            <wp:extent cx="5940425" cy="3983990"/>
+            <wp:effectExtent l="0" t="0" r="0" b="0"/>
+            <wp:wrapSquare wrapText="largest"/>
+            <wp:docPr id="1" name="Изображение2" descr=""/>
+            <wp:cNvGraphicFramePr>
+              <a:graphicFrameLocks xmlns:a="http://schemas.openxmlformats.org/drawingml/2006/main" noChangeAspect="1"/>
+            </wp:cNvGraphicFramePr>
+            <a:graphic xmlns:a="http://schemas.openxmlformats.org/drawingml/2006/main">
+              <a:graphicData uri="http://schemas.openxmlformats.org/drawingml/2006/picture">
+                <pic:pic xmlns:pic="http://schemas.openxmlformats.org/drawingml/2006/picture">
+                  <pic:nvPicPr>
+                    <pic:cNvPr id="1" name="Изображение2" descr=""/>
+                    <pic:cNvPicPr>
+                      <a:picLocks noChangeAspect="1" noChangeArrowheads="1"/>
+                    </pic:cNvPicPr>
+                  </pic:nvPicPr>
+                  <pic:blipFill>
+                    <a:blip r:embed="rId2"/>
+                    <a:stretch>
+                      <a:fillRect/>
+                    </a:stretch>
+                  </pic:blipFill>
+                  <pic:spPr bwMode="auto">
+                    <a:xfrm>
+                      <a:off x="0" y="0"/>
+                      <a:ext cx="5940425" cy="3983990"/>
+                    </a:xfrm>
+                    <a:prstGeom prst="rect">
+                      <a:avLst/>
+                    </a:prstGeom>
+                  </pic:spPr>
+                </pic:pic>
+              </a:graphicData>
+            </a:graphic>
+          </wp:anchor>
+        </w:drawing>
+      </w:r>
+    </w:p>
+    <w:p>
+      <w:pPr>
+        <w:pStyle w:val="Normal"/>
+        <w:widowControl/>
+        <w:bidi w:val="0"/>
+        <w:spacing w:lineRule="auto" w:line="360" w:before="0" w:after="0"/>
+        <w:ind w:firstLine="737" w:left="0" w:right="0"/>
+        <w:jc w:val="left"/>
+        <w:rPr>
+          <w:rFonts w:ascii="Times New Roman" w:hAnsi="Times New Roman"/>
+          <w:sz w:val="28"/>
+          <w:szCs w:val="28"/>
+        </w:rPr>
+      </w:pPr>
+      <w:r>
+        <w:rPr>
+          <w:rFonts w:ascii="Times New Roman" w:hAnsi="Times New Roman"/>
+          <w:sz w:val="28"/>
+          <w:szCs w:val="28"/>
+        </w:rPr>
+        <w:drawing>
+          <wp:anchor behindDoc="0" distT="0" distB="0" distL="0" distR="0" simplePos="0" locked="0" layoutInCell="0" allowOverlap="1" relativeHeight="18">
+            <wp:simplePos x="0" y="0"/>
+            <wp:positionH relativeFrom="column">
+              <wp:align>center</wp:align>
+            </wp:positionH>
+            <wp:positionV relativeFrom="paragraph">
+              <wp:posOffset>635</wp:posOffset>
+            </wp:positionV>
+            <wp:extent cx="5940425" cy="3983990"/>
+            <wp:effectExtent l="0" t="0" r="0" b="0"/>
+            <wp:wrapSquare wrapText="largest"/>
+            <wp:docPr id="2" name="Изображение1" descr=""/>
+            <wp:cNvGraphicFramePr>
+              <a:graphicFrameLocks xmlns:a="http://schemas.openxmlformats.org/drawingml/2006/main" noChangeAspect="1"/>
+            </wp:cNvGraphicFramePr>
+            <a:graphic xmlns:a="http://schemas.openxmlformats.org/drawingml/2006/main">
+              <a:graphicData uri="http://schemas.openxmlformats.org/drawingml/2006/picture">
+                <pic:pic xmlns:pic="http://schemas.openxmlformats.org/drawingml/2006/picture">
+                  <pic:nvPicPr>
+                    <pic:cNvPr id="2" name="Изображение1" descr=""/>
+                    <pic:cNvPicPr>
+                      <a:picLocks noChangeAspect="1" noChangeArrowheads="1"/>
+                    </pic:cNvPicPr>
+                  </pic:nvPicPr>
+                  <pic:blipFill>
+                    <a:blip r:embed="rId3"/>
+                    <a:stretch>
+                      <a:fillRect/>
+                    </a:stretch>
+                  </pic:blipFill>
+                  <pic:spPr bwMode="auto">
+                    <a:xfrm>
+                      <a:off x="0" y="0"/>
+                      <a:ext cx="5940425" cy="3983990"/>
+                    </a:xfrm>
+                    <a:prstGeom prst="rect">
+                      <a:avLst/>
+                    </a:prstGeom>
+                  </pic:spPr>
+                </pic:pic>
+              </a:graphicData>
+            </a:graphic>
+          </wp:anchor>
+        </w:drawing>
+      </w:r>
+    </w:p>
+    <w:p>
+      <w:pPr>
         <w:pStyle w:val="Style20"/>
         <w:widowControl/>
         <w:bidi w:val="0"/>
@@ -3486,7 +3608,6 @@
           <w:sz w:val="28"/>
           <w:szCs w:val="28"/>
         </w:rPr>
-        <w:t>Подставляем пробную точку (0,0) в каждое неравенство</w:t>
       </w:r>
     </w:p>
     <w:p>
@@ -3510,633 +3631,11 @@
           <w:szCs w:val="28"/>
         </w:rPr>
       </w:r>
-      <m:oMath xmlns:m="http://schemas.openxmlformats.org/officeDocument/2006/math">
-        <m:r>
-          <w:rPr>
-            <w:rFonts w:ascii="Cambria Math" w:hAnsi="Cambria Math"/>
-          </w:rPr>
-          <m:t xml:space="preserve">2</m:t>
-        </m:r>
-        <m:r>
-          <w:rPr>
-            <w:rFonts w:ascii="Cambria Math" w:hAnsi="Cambria Math"/>
-          </w:rPr>
-          <m:t xml:space="preserve">∗</m:t>
-        </m:r>
-        <m:r>
-          <w:rPr>
-            <w:rFonts w:ascii="Cambria Math" w:hAnsi="Cambria Math"/>
-          </w:rPr>
-          <m:t xml:space="preserve">0</m:t>
-        </m:r>
-        <m:r>
-          <w:rPr>
-            <w:rFonts w:ascii="Cambria Math" w:hAnsi="Cambria Math"/>
-          </w:rPr>
-          <m:t xml:space="preserve">+</m:t>
-        </m:r>
-        <m:r>
-          <w:rPr>
-            <w:rFonts w:ascii="Cambria Math" w:hAnsi="Cambria Math"/>
-          </w:rPr>
-          <m:t xml:space="preserve">5</m:t>
-        </m:r>
-        <m:r>
-          <w:rPr>
-            <w:rFonts w:ascii="Cambria Math" w:hAnsi="Cambria Math"/>
-          </w:rPr>
-          <m:t xml:space="preserve">∗</m:t>
-        </m:r>
-        <m:r>
-          <w:rPr>
-            <w:rFonts w:ascii="Cambria Math" w:hAnsi="Cambria Math"/>
-          </w:rPr>
-          <m:t xml:space="preserve">0</m:t>
-        </m:r>
-        <m:r>
-          <w:rPr>
-            <w:rFonts w:ascii="Cambria Math" w:hAnsi="Cambria Math"/>
-          </w:rPr>
-          <m:t xml:space="preserve">≥</m:t>
-        </m:r>
-        <m:r>
-          <w:rPr>
-            <w:rFonts w:ascii="Cambria Math" w:hAnsi="Cambria Math"/>
-          </w:rPr>
-          <m:t xml:space="preserve">16</m:t>
-        </m:r>
-      </m:oMath>
-      <w:r>
-        <w:rPr>
-          <w:rFonts w:ascii="Times New Roman" w:hAnsi="Times New Roman"/>
-          <w:sz w:val="28"/>
-          <w:szCs w:val="28"/>
-        </w:rPr>
-        <w:t xml:space="preserve"> </w:t>
-      </w:r>
-      <w:r>
-        <w:rPr>
-          <w:rFonts w:ascii="Times New Roman" w:hAnsi="Times New Roman"/>
-          <w:sz w:val="28"/>
-          <w:szCs w:val="28"/>
-        </w:rPr>
-        <w:t xml:space="preserve">- </w:t>
-      </w:r>
-      <w:r>
-        <w:rPr>
-          <w:rFonts w:ascii="Times New Roman" w:hAnsi="Times New Roman"/>
-          <w:sz w:val="28"/>
-          <w:szCs w:val="28"/>
-        </w:rPr>
-        <w:t>не верно</w:t>
-      </w:r>
-    </w:p>
-    <w:p>
-      <w:pPr>
-        <w:pStyle w:val="Style20"/>
-        <w:widowControl/>
-        <w:bidi w:val="0"/>
-        <w:spacing w:lineRule="auto" w:line="360" w:before="0" w:after="0"/>
-        <w:ind w:firstLine="737" w:left="0" w:right="0"/>
-        <w:jc w:val="left"/>
-        <w:rPr>
-          <w:rFonts w:ascii="Times New Roman" w:hAnsi="Times New Roman"/>
-          <w:sz w:val="28"/>
-          <w:szCs w:val="28"/>
-        </w:rPr>
-      </w:pPr>
-      <w:r>
-        <w:rPr>
-          <w:rFonts w:ascii="Times New Roman" w:hAnsi="Times New Roman"/>
-          <w:sz w:val="28"/>
-          <w:szCs w:val="28"/>
-        </w:rPr>
-      </w:r>
-      <m:oMath xmlns:m="http://schemas.openxmlformats.org/officeDocument/2006/math">
-        <m:r>
-          <w:rPr>
-            <w:rFonts w:ascii="Cambria Math" w:hAnsi="Cambria Math"/>
-          </w:rPr>
-          <m:t xml:space="preserve">4</m:t>
-        </m:r>
-        <m:r>
-          <w:rPr>
-            <w:rFonts w:ascii="Cambria Math" w:hAnsi="Cambria Math"/>
-          </w:rPr>
-          <m:t xml:space="preserve">∗</m:t>
-        </m:r>
-        <m:r>
-          <w:rPr>
-            <w:rFonts w:ascii="Cambria Math" w:hAnsi="Cambria Math"/>
-          </w:rPr>
-          <m:t xml:space="preserve">0</m:t>
-        </m:r>
-        <m:r>
-          <w:rPr>
-            <w:rFonts w:ascii="Cambria Math" w:hAnsi="Cambria Math"/>
-          </w:rPr>
-          <m:t xml:space="preserve">+</m:t>
-        </m:r>
-        <m:r>
-          <w:rPr>
-            <w:rFonts w:ascii="Cambria Math" w:hAnsi="Cambria Math"/>
-          </w:rPr>
-          <m:t xml:space="preserve">0</m:t>
-        </m:r>
-        <m:r>
-          <w:rPr>
-            <w:rFonts w:ascii="Cambria Math" w:hAnsi="Cambria Math"/>
-          </w:rPr>
-          <m:t xml:space="preserve">≥</m:t>
-        </m:r>
-        <m:r>
-          <w:rPr>
-            <w:rFonts w:ascii="Cambria Math" w:hAnsi="Cambria Math"/>
-          </w:rPr>
-          <m:t xml:space="preserve">9</m:t>
-        </m:r>
-      </m:oMath>
-      <w:r>
-        <w:rPr>
-          <w:rFonts w:ascii="Times New Roman" w:hAnsi="Times New Roman"/>
-          <w:sz w:val="28"/>
-          <w:szCs w:val="28"/>
-        </w:rPr>
-        <w:t xml:space="preserve"> </w:t>
-      </w:r>
-      <w:r>
-        <w:rPr>
-          <w:rFonts w:ascii="Times New Roman" w:hAnsi="Times New Roman"/>
-          <w:sz w:val="28"/>
-          <w:szCs w:val="28"/>
-        </w:rPr>
-        <w:t xml:space="preserve">- </w:t>
-      </w:r>
-      <w:r>
-        <w:rPr>
-          <w:rFonts w:ascii="Times New Roman" w:hAnsi="Times New Roman"/>
-          <w:sz w:val="28"/>
-          <w:szCs w:val="28"/>
-        </w:rPr>
-        <w:t>не верно</w:t>
-      </w:r>
-    </w:p>
-    <w:p>
-      <w:pPr>
-        <w:pStyle w:val="Style20"/>
-        <w:widowControl/>
-        <w:bidi w:val="0"/>
-        <w:spacing w:lineRule="auto" w:line="360" w:before="0" w:after="0"/>
-        <w:ind w:firstLine="737" w:left="0" w:right="0"/>
-        <w:jc w:val="left"/>
-        <w:rPr>
-          <w:rFonts w:ascii="Times New Roman" w:hAnsi="Times New Roman"/>
-          <w:sz w:val="28"/>
-          <w:szCs w:val="28"/>
-        </w:rPr>
-      </w:pPr>
-      <w:r>
-        <w:rPr>
-          <w:rFonts w:ascii="Times New Roman" w:hAnsi="Times New Roman"/>
-          <w:sz w:val="28"/>
-          <w:szCs w:val="28"/>
-        </w:rPr>
-      </w:r>
-      <m:oMath xmlns:m="http://schemas.openxmlformats.org/officeDocument/2006/math">
-        <m:r>
-          <w:rPr>
-            <w:rFonts w:ascii="Cambria Math" w:hAnsi="Cambria Math"/>
-          </w:rPr>
-          <m:t xml:space="preserve">3</m:t>
-        </m:r>
-        <m:r>
-          <w:rPr>
-            <w:rFonts w:ascii="Cambria Math" w:hAnsi="Cambria Math"/>
-          </w:rPr>
-          <m:t xml:space="preserve">∗</m:t>
-        </m:r>
-        <m:r>
-          <w:rPr>
-            <w:rFonts w:ascii="Cambria Math" w:hAnsi="Cambria Math"/>
-          </w:rPr>
-          <m:t xml:space="preserve">0</m:t>
-        </m:r>
-        <m:r>
-          <w:rPr>
-            <w:rFonts w:ascii="Cambria Math" w:hAnsi="Cambria Math"/>
-          </w:rPr>
-          <m:t xml:space="preserve">+</m:t>
-        </m:r>
-        <m:r>
-          <w:rPr>
-            <w:rFonts w:ascii="Cambria Math" w:hAnsi="Cambria Math"/>
-          </w:rPr>
-          <m:t xml:space="preserve">2</m:t>
-        </m:r>
-        <m:r>
-          <w:rPr>
-            <w:rFonts w:ascii="Cambria Math" w:hAnsi="Cambria Math"/>
-          </w:rPr>
-          <m:t xml:space="preserve">∗</m:t>
-        </m:r>
-        <m:r>
-          <w:rPr>
-            <w:rFonts w:ascii="Cambria Math" w:hAnsi="Cambria Math"/>
-          </w:rPr>
-          <m:t xml:space="preserve">0</m:t>
-        </m:r>
-        <m:r>
-          <w:rPr>
-            <w:rFonts w:ascii="Cambria Math" w:hAnsi="Cambria Math"/>
-          </w:rPr>
-          <m:t xml:space="preserve">≥</m:t>
-        </m:r>
-        <m:r>
-          <w:rPr>
-            <w:rFonts w:ascii="Cambria Math" w:hAnsi="Cambria Math"/>
-          </w:rPr>
-          <m:t xml:space="preserve">13</m:t>
-        </m:r>
-      </m:oMath>
-      <w:r>
-        <w:rPr>
-          <w:rFonts w:ascii="Times New Roman" w:hAnsi="Times New Roman"/>
-          <w:sz w:val="28"/>
-          <w:szCs w:val="28"/>
-        </w:rPr>
-        <w:t xml:space="preserve"> </w:t>
-      </w:r>
-      <w:r>
-        <w:rPr>
-          <w:rFonts w:ascii="Times New Roman" w:hAnsi="Times New Roman"/>
-          <w:sz w:val="28"/>
-          <w:szCs w:val="28"/>
-        </w:rPr>
-        <w:t xml:space="preserve">- </w:t>
-      </w:r>
-      <w:r>
-        <w:rPr>
-          <w:rFonts w:ascii="Times New Roman" w:hAnsi="Times New Roman"/>
-          <w:sz w:val="28"/>
-          <w:szCs w:val="28"/>
-        </w:rPr>
-        <w:t>не верно</w:t>
-      </w:r>
-    </w:p>
-    <w:p>
-      <w:pPr>
-        <w:pStyle w:val="Style20"/>
-        <w:widowControl/>
-        <w:bidi w:val="0"/>
-        <w:spacing w:lineRule="auto" w:line="360" w:before="0" w:after="0"/>
-        <w:ind w:firstLine="737" w:left="0" w:right="0"/>
-        <w:jc w:val="left"/>
-        <w:rPr>
-          <w:rFonts w:ascii="Times New Roman" w:hAnsi="Times New Roman"/>
-          <w:sz w:val="28"/>
-          <w:szCs w:val="28"/>
-        </w:rPr>
-      </w:pPr>
-      <w:r>
-        <w:rPr>
-          <w:rFonts w:ascii="Times New Roman" w:hAnsi="Times New Roman"/>
-          <w:sz w:val="28"/>
-          <w:szCs w:val="28"/>
-        </w:rPr>
-      </w:r>
-    </w:p>
-    <w:p>
-      <w:pPr>
-        <w:pStyle w:val="Style20"/>
-        <w:widowControl/>
-        <w:bidi w:val="0"/>
-        <w:spacing w:lineRule="auto" w:line="360" w:before="0" w:after="0"/>
-        <w:ind w:firstLine="737" w:left="0" w:right="0"/>
-        <w:jc w:val="left"/>
-        <w:rPr>
-          <w:rFonts w:ascii="Times New Roman" w:hAnsi="Times New Roman"/>
-          <w:sz w:val="28"/>
-          <w:szCs w:val="28"/>
-        </w:rPr>
-      </w:pPr>
-      <w:r>
-        <w:rPr>
-          <w:rFonts w:ascii="Times New Roman" w:hAnsi="Times New Roman"/>
-          <w:sz w:val="28"/>
-          <w:szCs w:val="28"/>
-        </w:rPr>
-        <w:t xml:space="preserve">Z=48:  </w:t>
-      </w:r>
-      <w:r>
-        <w:rPr>
-          <w:rFonts w:ascii="Times New Roman" w:hAnsi="Times New Roman"/>
-          <w:sz w:val="28"/>
-          <w:szCs w:val="28"/>
-        </w:rPr>
-      </w:r>
-      <m:oMath xmlns:m="http://schemas.openxmlformats.org/officeDocument/2006/math">
-        <m:r>
-          <w:rPr>
-            <w:rFonts w:ascii="Cambria Math" w:hAnsi="Cambria Math"/>
-          </w:rPr>
-          <m:t xml:space="preserve">−</m:t>
-        </m:r>
-        <m:r>
-          <w:rPr>
-            <w:rFonts w:ascii="Cambria Math" w:hAnsi="Cambria Math"/>
-          </w:rPr>
-          <m:t xml:space="preserve">6</m:t>
-        </m:r>
-        <m:sSub>
-          <m:e>
-            <m:r>
-              <w:rPr>
-                <w:rFonts w:ascii="Cambria Math" w:hAnsi="Cambria Math"/>
-              </w:rPr>
-              <m:t xml:space="preserve">x</m:t>
-            </m:r>
-          </m:e>
-          <m:sub>
-            <m:r>
-              <w:rPr>
-                <w:rFonts w:ascii="Cambria Math" w:hAnsi="Cambria Math"/>
-              </w:rPr>
-              <m:t xml:space="preserve">1</m:t>
-            </m:r>
-          </m:sub>
-        </m:sSub>
-        <m:r>
-          <w:rPr>
-            <w:rFonts w:ascii="Cambria Math" w:hAnsi="Cambria Math"/>
-          </w:rPr>
-          <m:t xml:space="preserve">−</m:t>
-        </m:r>
-        <m:sSub>
-          <m:e>
-            <m:r>
-              <w:rPr>
-                <w:rFonts w:ascii="Cambria Math" w:hAnsi="Cambria Math"/>
-              </w:rPr>
-              <m:t xml:space="preserve">x</m:t>
-            </m:r>
-          </m:e>
-          <m:sub>
-            <m:r>
-              <w:rPr>
-                <w:rFonts w:ascii="Cambria Math" w:hAnsi="Cambria Math"/>
-              </w:rPr>
-              <m:t xml:space="preserve">2</m:t>
-            </m:r>
-          </m:sub>
-        </m:sSub>
-        <m:r>
-          <w:rPr>
-            <w:rFonts w:ascii="Cambria Math" w:hAnsi="Cambria Math"/>
-          </w:rPr>
-          <m:t xml:space="preserve">=</m:t>
-        </m:r>
-        <m:r>
-          <w:rPr>
-            <w:rFonts w:ascii="Cambria Math" w:hAnsi="Cambria Math"/>
-          </w:rPr>
-          <m:t xml:space="preserve">48</m:t>
-        </m:r>
-      </m:oMath>
-    </w:p>
-    <w:tbl>
-      <w:tblPr>
-        <w:tblW w:w="3000" w:type="dxa"/>
-        <w:jc w:val="left"/>
-        <w:tblInd w:w="55" w:type="dxa"/>
-        <w:tblLayout w:type="fixed"/>
-        <w:tblCellMar>
-          <w:top w:w="55" w:type="dxa"/>
-          <w:left w:w="55" w:type="dxa"/>
-          <w:bottom w:w="55" w:type="dxa"/>
-          <w:right w:w="55" w:type="dxa"/>
-        </w:tblCellMar>
-      </w:tblPr>
-      <w:tblGrid>
-        <w:gridCol w:w="1000"/>
-        <w:gridCol w:w="1000"/>
-        <w:gridCol w:w="1000"/>
-      </w:tblGrid>
-      <w:tr>
-        <w:trPr/>
-        <w:tc>
-          <w:tcPr>
-            <w:tcW w:w="1000" w:type="dxa"/>
-            <w:tcBorders>
-              <w:top w:val="single" w:sz="4" w:space="0" w:color="000000"/>
-              <w:left w:val="single" w:sz="4" w:space="0" w:color="000000"/>
-              <w:bottom w:val="single" w:sz="4" w:space="0" w:color="000000"/>
-            </w:tcBorders>
-          </w:tcPr>
-          <w:p>
-            <w:pPr>
-              <w:pStyle w:val="Style22"/>
-              <w:spacing w:before="0" w:after="200"/>
-              <w:rPr/>
-            </w:pPr>
-            <w:r>
-              <w:rPr/>
-              <w:t>x</w:t>
-            </w:r>
-            <w:r>
-              <w:rPr>
-                <w:vertAlign w:val="subscript"/>
-              </w:rPr>
-              <w:t>1</w:t>
-            </w:r>
-          </w:p>
-        </w:tc>
-        <w:tc>
-          <w:tcPr>
-            <w:tcW w:w="1000" w:type="dxa"/>
-            <w:tcBorders>
-              <w:top w:val="single" w:sz="4" w:space="0" w:color="000000"/>
-              <w:left w:val="single" w:sz="4" w:space="0" w:color="000000"/>
-              <w:bottom w:val="single" w:sz="4" w:space="0" w:color="000000"/>
-            </w:tcBorders>
-          </w:tcPr>
-          <w:p>
-            <w:pPr>
-              <w:pStyle w:val="Style22"/>
-              <w:spacing w:before="0" w:after="200"/>
-              <w:rPr/>
-            </w:pPr>
-            <w:r>
-              <w:rPr/>
-              <w:t>0</w:t>
-            </w:r>
-          </w:p>
-        </w:tc>
-        <w:tc>
-          <w:tcPr>
-            <w:tcW w:w="1000" w:type="dxa"/>
-            <w:tcBorders>
-              <w:top w:val="single" w:sz="4" w:space="0" w:color="000000"/>
-              <w:left w:val="single" w:sz="4" w:space="0" w:color="000000"/>
-              <w:bottom w:val="single" w:sz="4" w:space="0" w:color="000000"/>
-              <w:right w:val="single" w:sz="4" w:space="0" w:color="000000"/>
-            </w:tcBorders>
-          </w:tcPr>
-          <w:p>
-            <w:pPr>
-              <w:pStyle w:val="Style22"/>
-              <w:spacing w:before="0" w:after="200"/>
-              <w:rPr/>
-            </w:pPr>
-            <w:r>
-              <w:rPr/>
-              <w:t>-8</w:t>
-            </w:r>
-          </w:p>
-        </w:tc>
-      </w:tr>
-      <w:tr>
-        <w:trPr>
-          <w:trHeight w:val="588" w:hRule="atLeast"/>
-        </w:trPr>
-        <w:tc>
-          <w:tcPr>
-            <w:tcW w:w="1000" w:type="dxa"/>
-            <w:tcBorders>
-              <w:left w:val="single" w:sz="4" w:space="0" w:color="000000"/>
-              <w:bottom w:val="single" w:sz="4" w:space="0" w:color="000000"/>
-            </w:tcBorders>
-          </w:tcPr>
-          <w:p>
-            <w:pPr>
-              <w:pStyle w:val="Style22"/>
-              <w:spacing w:before="0" w:after="200"/>
-              <w:rPr/>
-            </w:pPr>
-            <w:r>
-              <w:rPr/>
-              <w:t>x</w:t>
-            </w:r>
-            <w:r>
-              <w:rPr>
-                <w:vertAlign w:val="subscript"/>
-              </w:rPr>
-              <w:t>2</w:t>
-            </w:r>
-          </w:p>
-        </w:tc>
-        <w:tc>
-          <w:tcPr>
-            <w:tcW w:w="1000" w:type="dxa"/>
-            <w:tcBorders>
-              <w:left w:val="single" w:sz="4" w:space="0" w:color="000000"/>
-              <w:bottom w:val="single" w:sz="4" w:space="0" w:color="000000"/>
-            </w:tcBorders>
-          </w:tcPr>
-          <w:p>
-            <w:pPr>
-              <w:pStyle w:val="Style22"/>
-              <w:spacing w:before="0" w:after="200"/>
-              <w:rPr/>
-            </w:pPr>
-            <w:r>
-              <w:rPr/>
-              <w:t>-48</w:t>
-            </w:r>
-          </w:p>
-        </w:tc>
-        <w:tc>
-          <w:tcPr>
-            <w:tcW w:w="1000" w:type="dxa"/>
-            <w:tcBorders>
-              <w:left w:val="single" w:sz="4" w:space="0" w:color="000000"/>
-              <w:bottom w:val="single" w:sz="4" w:space="0" w:color="000000"/>
-              <w:right w:val="single" w:sz="4" w:space="0" w:color="000000"/>
-            </w:tcBorders>
-          </w:tcPr>
-          <w:p>
-            <w:pPr>
-              <w:pStyle w:val="Style22"/>
-              <w:spacing w:before="0" w:after="200"/>
-              <w:rPr/>
-            </w:pPr>
-            <w:r>
-              <w:rPr/>
-              <w:t>0</w:t>
-            </w:r>
-          </w:p>
-        </w:tc>
-      </w:tr>
-    </w:tbl>
-    <w:p>
-      <w:pPr>
-        <w:pStyle w:val="Normal"/>
-        <w:widowControl/>
-        <w:bidi w:val="0"/>
-        <w:spacing w:lineRule="auto" w:line="360" w:before="0" w:after="0"/>
-        <w:ind w:firstLine="737" w:left="0" w:right="0"/>
-        <w:jc w:val="left"/>
-        <w:rPr>
-          <w:rFonts w:ascii="Times New Roman" w:hAnsi="Times New Roman"/>
-          <w:sz w:val="28"/>
-          <w:szCs w:val="28"/>
-        </w:rPr>
-      </w:pPr>
-      <w:r>
-        <w:rPr>
-          <w:rFonts w:ascii="Times New Roman" w:hAnsi="Times New Roman"/>
-          <w:sz w:val="28"/>
-          <w:szCs w:val="28"/>
-        </w:rPr>
-      </w:r>
-    </w:p>
-    <w:p>
-      <w:pPr>
-        <w:pStyle w:val="Style20"/>
-        <w:widowControl/>
-        <w:bidi w:val="0"/>
-        <w:spacing w:lineRule="auto" w:line="360" w:before="0" w:after="0"/>
-        <w:ind w:firstLine="737" w:left="0" w:right="0"/>
-        <w:jc w:val="left"/>
-        <w:rPr>
-          <w:rFonts w:ascii="Times New Roman" w:hAnsi="Times New Roman"/>
-          <w:sz w:val="28"/>
-          <w:szCs w:val="28"/>
-        </w:rPr>
-      </w:pPr>
-      <w:r>
-        <w:rPr>
-          <w:rFonts w:ascii="Times New Roman" w:hAnsi="Times New Roman"/>
-          <w:sz w:val="28"/>
-          <w:szCs w:val="28"/>
-        </w:rPr>
-      </w:r>
-    </w:p>
-    <w:p>
-      <w:pPr>
-        <w:pStyle w:val="Style20"/>
-        <w:widowControl/>
-        <w:bidi w:val="0"/>
-        <w:spacing w:lineRule="auto" w:line="360" w:before="0" w:after="0"/>
-        <w:ind w:firstLine="737" w:left="0" w:right="0"/>
-        <w:jc w:val="left"/>
-        <w:rPr>
-          <w:rFonts w:ascii="Times New Roman" w:hAnsi="Times New Roman"/>
-          <w:sz w:val="28"/>
-          <w:szCs w:val="28"/>
-        </w:rPr>
-      </w:pPr>
-      <w:r>
-        <w:rPr>
-          <w:rFonts w:ascii="Times New Roman" w:hAnsi="Times New Roman"/>
-          <w:sz w:val="28"/>
-          <w:szCs w:val="28"/>
-        </w:rPr>
-      </w:r>
     </w:p>
     <w:sectPr>
-      <w:footerReference w:type="even" r:id="rId2"/>
-      <w:footerReference w:type="default" r:id="rId3"/>
-      <w:footerReference w:type="first" r:id="rId4"/>
+      <w:footerReference w:type="even" r:id="rId4"/>
+      <w:footerReference w:type="default" r:id="rId5"/>
+      <w:footerReference w:type="first" r:id="rId6"/>
       <w:type w:val="nextPage"/>
       <w:pgSz w:w="11906" w:h="16838"/>
       <w:pgMar w:left="1701" w:right="850" w:gutter="0" w:header="0" w:top="899" w:footer="708" w:bottom="1134"/>
@@ -4174,7 +3673,7 @@
               <wp:extent cx="14605" cy="14605"/>
               <wp:effectExtent l="0" t="0" r="0" b="0"/>
               <wp:wrapSquare wrapText="bothSides"/>
-              <wp:docPr id="1" name="Врезка1"/>
+              <wp:docPr id="3" name="Врезка1"/>
               <a:graphic xmlns:a="http://schemas.openxmlformats.org/drawingml/2006/main">
                 <a:graphicData uri="http://schemas.microsoft.com/office/word/2010/wordprocessingShape">
                   <wps:wsp>
@@ -4211,30 +3710,35 @@
                           <w:r>
                             <w:rPr>
                               <w:rStyle w:val="PageNumber"/>
+                              <w:color w:val="000000"/>
                             </w:rPr>
                             <w:fldChar w:fldCharType="begin"/>
                           </w:r>
                           <w:r>
                             <w:rPr>
                               <w:rStyle w:val="PageNumber"/>
+                              <w:color w:val="000000"/>
                             </w:rPr>
                             <w:instrText xml:space="preserve"> PAGE </w:instrText>
                           </w:r>
                           <w:r>
                             <w:rPr>
                               <w:rStyle w:val="PageNumber"/>
+                              <w:color w:val="000000"/>
                             </w:rPr>
                             <w:fldChar w:fldCharType="separate"/>
                           </w:r>
                           <w:r>
                             <w:rPr>
                               <w:rStyle w:val="PageNumber"/>
+                              <w:color w:val="000000"/>
                             </w:rPr>
                             <w:t>0</w:t>
                           </w:r>
                           <w:r>
                             <w:rPr>
                               <w:rStyle w:val="PageNumber"/>
+                              <w:color w:val="000000"/>
                             </w:rPr>
                             <w:fldChar w:fldCharType="end"/>
                           </w:r>
@@ -4252,8 +3756,8 @@
         </mc:Choice>
         <mc:Fallback>
           <w:pict>
-            <v:rect id="shape_0" ID="Врезка1" path="m0,0l-2147483645,0l-2147483645,-2147483646l0,-2147483646xe" fillcolor="white" stroked="f" o:allowincell="f" style="position:absolute;margin-left:0pt;margin-top:0.05pt;width:1.1pt;height:1.1pt;mso-wrap-style:square;v-text-anchor:top;mso-position-horizontal:right;mso-position-horizontal-relative:margin">
-              <v:fill o:detectmouseclick="t" type="solid" color2="black" opacity="0"/>
+            <v:rect id="shape_0" ID="Врезка1" path="m0,0l-2147483645,0l-2147483645,-2147483646l0,-2147483646xe" stroked="f" o:allowincell="f" style="position:absolute;margin-left:0pt;margin-top:0.05pt;width:1.1pt;height:1.1pt;mso-wrap-style:square;v-text-anchor:top;mso-position-horizontal:right;mso-position-horizontal-relative:margin">
+              <v:fill o:detectmouseclick="t" on="false"/>
               <v:stroke color="#3465a4" joinstyle="round" endcap="flat"/>
               <v:textbox>
                 <w:txbxContent>
@@ -4268,30 +3772,35 @@
                     <w:r>
                       <w:rPr>
                         <w:rStyle w:val="PageNumber"/>
+                        <w:color w:val="000000"/>
                       </w:rPr>
                       <w:fldChar w:fldCharType="begin"/>
                     </w:r>
                     <w:r>
                       <w:rPr>
                         <w:rStyle w:val="PageNumber"/>
+                        <w:color w:val="000000"/>
                       </w:rPr>
                       <w:instrText xml:space="preserve"> PAGE </w:instrText>
                     </w:r>
                     <w:r>
                       <w:rPr>
                         <w:rStyle w:val="PageNumber"/>
+                        <w:color w:val="000000"/>
                       </w:rPr>
                       <w:fldChar w:fldCharType="separate"/>
                     </w:r>
                     <w:r>
                       <w:rPr>
                         <w:rStyle w:val="PageNumber"/>
+                        <w:color w:val="000000"/>
                       </w:rPr>
                       <w:t>0</w:t>
                     </w:r>
                     <w:r>
                       <w:rPr>
                         <w:rStyle w:val="PageNumber"/>
+                        <w:color w:val="000000"/>
                       </w:rPr>
                       <w:fldChar w:fldCharType="end"/>
                     </w:r>
@@ -4322,7 +3831,7 @@
       <mc:AlternateContent>
         <mc:Choice Requires="wps">
           <w:drawing>
-            <wp:anchor behindDoc="1" distT="0" distB="0" distL="0" distR="0" simplePos="0" locked="0" layoutInCell="0" allowOverlap="1" relativeHeight="8">
+            <wp:anchor behindDoc="1" distT="0" distB="0" distL="0" distR="0" simplePos="0" locked="0" layoutInCell="0" allowOverlap="1" relativeHeight="10">
               <wp:simplePos x="0" y="0"/>
               <wp:positionH relativeFrom="margin">
                 <wp:align>right</wp:align>
@@ -4333,7 +3842,7 @@
               <wp:extent cx="14605" cy="189230"/>
               <wp:effectExtent l="0" t="0" r="0" b="0"/>
               <wp:wrapSquare wrapText="bothSides"/>
-              <wp:docPr id="2" name="Врезка2"/>
+              <wp:docPr id="4" name="Врезка2"/>
               <a:graphic xmlns:a="http://schemas.openxmlformats.org/drawingml/2006/main">
                 <a:graphicData uri="http://schemas.microsoft.com/office/word/2010/wordprocessingShape">
                   <wps:wsp>
@@ -4384,8 +3893,8 @@
         </mc:Choice>
         <mc:Fallback>
           <w:pict>
-            <v:rect id="shape_0" ID="Врезка2" path="m0,0l-2147483645,0l-2147483645,-2147483646l0,-2147483646xe" fillcolor="white" stroked="f" o:allowincell="f" style="position:absolute;margin-left:466.5pt;margin-top:0.05pt;width:1.1pt;height:14.85pt;mso-wrap-style:none;v-text-anchor:middle;mso-position-horizontal:right;mso-position-horizontal-relative:margin">
-              <v:fill o:detectmouseclick="t" type="solid" color2="black" opacity="0"/>
+            <v:rect id="shape_0" ID="Врезка2" path="m0,0l-2147483645,0l-2147483645,-2147483646l0,-2147483646xe" stroked="f" o:allowincell="f" style="position:absolute;margin-left:466.5pt;margin-top:0.05pt;width:1.1pt;height:14.85pt;mso-wrap-style:none;v-text-anchor:middle;mso-position-horizontal:right;mso-position-horizontal-relative:margin">
+              <v:fill o:detectmouseclick="t" on="false"/>
               <v:stroke color="#3465a4" joinstyle="round" endcap="flat"/>
               <v:textbox>
                 <w:txbxContent>
@@ -4427,7 +3936,7 @@
       <mc:AlternateContent>
         <mc:Choice Requires="wps">
           <w:drawing>
-            <wp:anchor behindDoc="1" distT="0" distB="0" distL="0" distR="0" simplePos="0" locked="0" layoutInCell="0" allowOverlap="1" relativeHeight="8">
+            <wp:anchor behindDoc="1" distT="0" distB="0" distL="0" distR="0" simplePos="0" locked="0" layoutInCell="0" allowOverlap="1" relativeHeight="10">
               <wp:simplePos x="0" y="0"/>
               <wp:positionH relativeFrom="margin">
                 <wp:align>right</wp:align>
@@ -4438,7 +3947,7 @@
               <wp:extent cx="14605" cy="189230"/>
               <wp:effectExtent l="0" t="0" r="0" b="0"/>
               <wp:wrapSquare wrapText="bothSides"/>
-              <wp:docPr id="3" name="Врезка2"/>
+              <wp:docPr id="5" name="Врезка2"/>
               <a:graphic xmlns:a="http://schemas.openxmlformats.org/drawingml/2006/main">
                 <a:graphicData uri="http://schemas.microsoft.com/office/word/2010/wordprocessingShape">
                   <wps:wsp>
@@ -4489,8 +3998,8 @@
         </mc:Choice>
         <mc:Fallback>
           <w:pict>
-            <v:rect id="shape_0" ID="Врезка2" path="m0,0l-2147483645,0l-2147483645,-2147483646l0,-2147483646xe" fillcolor="white" stroked="f" o:allowincell="f" style="position:absolute;margin-left:466.5pt;margin-top:0.05pt;width:1.1pt;height:14.85pt;mso-wrap-style:none;v-text-anchor:middle;mso-position-horizontal:right;mso-position-horizontal-relative:margin">
-              <v:fill o:detectmouseclick="t" type="solid" color2="black" opacity="0"/>
+            <v:rect id="shape_0" ID="Врезка2" path="m0,0l-2147483645,0l-2147483645,-2147483646l0,-2147483646xe" stroked="f" o:allowincell="f" style="position:absolute;margin-left:466.5pt;margin-top:0.05pt;width:1.1pt;height:14.85pt;mso-wrap-style:none;v-text-anchor:middle;mso-position-horizontal:right;mso-position-horizontal-relative:margin">
+              <v:fill o:detectmouseclick="t" on="false"/>
               <v:stroke color="#3465a4" joinstyle="round" endcap="flat"/>
               <v:textbox>
                 <w:txbxContent>

</xml_diff>